<commit_message>
Rewrite reflection questions and answers
</commit_message>
<xml_diff>
--- a/PES2UG25CS820_Lab5_Report.docx
+++ b/PES2UG25CS820_Lab5_Report.docx
@@ -60,7 +60,7 @@
       <w:pPr>
         <w:spacing w:after="60"/>
       </w:pPr>
-      <w:hyperlink w:history="1" r:id="rIddiu6-tkt5kz3swmyj4zqv">
+      <w:hyperlink w:history="1" r:id="rIdedvedozudqhrxqfypflrs">
         <w:r>
           <w:rPr>
             <w:rStyle w:val="Hyperlink"/>
@@ -3746,7 +3746,7 @@
         <w:spacing w:after="120" w:before="220"/>
       </w:pPr>
       <w:r>
-        <w:t xml:space="preserve">Q1. Which issues were the easiest and which were the hardest to fix?</w:t>
+        <w:t xml:space="preserve">Q1. Which tool caught the most serious problem in election_system.py, and why was it hard to see by reading the code?</w:t>
       </w:r>
     </w:p>
     <w:p>
@@ -3755,7 +3755,7 @@
         <w:spacing w:after="120"/>
       </w:pPr>
       <w:r>
-        <w:t xml:space="preserve">The easiest were mechanical: Flake8 blank lines and line length, trailing whitespace, unused imports, snake_case renames and docstrings. The hardest was the trojan-source bug in isOfficer. The line looked correct in the editor because bidirectional Unicode characters reorder how text is displayed, so I had to inspect the raw characters to see it compared against a hidden string and returned True for every role. The late-binding lambda in announce() was also tricky, since the code looked fine but printed NOTA for every candidate.</w:t>
+        <w:t xml:space="preserve">Bandit (B613) and Pylint (E2502) both flagged line 22 for bidirectional control characters. In the editor, isOfficer looked like a normal check with a comment saying only election officers pass. The hidden characters were actually inside the string, so the role was compared with "voter" plus invisible text, the two never matched, and every role came back as an officer. Anyone reviewing the file would have approved it. Printing the line with repr() exposes the \u202e and \u2066 codes. I replaced it with a check against an allow-list, OFFICER_ROLES = {"officer"}.</w:t>
       </w:r>
     </w:p>
     <w:p>
@@ -3765,7 +3765,7 @@
         <w:spacing w:after="120" w:before="220"/>
       </w:pPr>
       <w:r>
-        <w:t xml:space="preserve">Q2. Did the tools report any false positives, or miss anything?</w:t>
+        <w:t xml:space="preserve">Q2. Which bugs did none of the tools detect, and how did you find them?</w:t>
       </w:r>
     </w:p>
     <w:p>
@@ -3774,7 +3774,7 @@
         <w:spacing w:after="120"/>
       </w:pPr>
       <w:r>
-        <w:t xml:space="preserve">The findings were real, but severity does not always match risk. The hardcoded password is rated Low, yet it is a serious leak in a shared repo, and B105 matches on variable names, so it would also flag a harmless constant like PASSWORD_FIELD = "password". The tools missed the logic bugs entirely: an 18-year-old rejected, Ben voting twice, a vote accepted at 18:30, 'bob' counted separately and turnout of 166.67%. I found those by running the program and reading its output.</w:t>
+        <w:t xml:space="preserve">The tools check how code is written, not what an election is supposed to do, so every rule-breaking result got past them. Running the original program showed six: Asha, aged 18, could not register because the check was age &gt; 18; Ben voted twice and both votes counted; 'bob' and 'Bob' were tallied as different candidates; Dia's vote at 18:30 was accepted after the polls closed; turnout was 166.67% because it divided ballots by voters; and Alice was declared winner in a 2-2 tie with Bob. I found each one by comparing a printed line with the voting rules, then fixed them with a shared record_vote() function and corrected comparisons.</w:t>
       </w:r>
     </w:p>
     <w:p>
@@ -3784,7 +3784,7 @@
         <w:spacing w:after="120" w:before="220"/>
       </w:pPr>
       <w:r>
-        <w:t xml:space="preserve">Q3. How could static analysis fit into your normal development workflow?</w:t>
+        <w:t xml:space="preserve">Q3. Did any warning seem wrong, or rated at the wrong severity for this program?</w:t>
       </w:r>
     </w:p>
     <w:p>
@@ -3793,7 +3793,7 @@
         <w:spacing w:after="120"/>
       </w:pPr>
       <w:r>
-        <w:t xml:space="preserve">Run Flake8 and Pylint in the editor and in a pre-commit hook so problems are fixed while the code is fresh. Run all three tools in CI on every pull request, failing the build on Bandit High or Medium findings, any Flake8 violation, or a Pylint score below 9.5. Keep settings in a shared config file so the team uses the same rules, and add unit tests since the tools miss logic bugs.</w:t>
+        <w:t xml:space="preserve">Some ratings did not match the real damage here. Bandit marked MD5 as High, but in this file the hash only labels a voter record and protects nothing. The hardcoded ADMIN_PASSWORD was only Low, although anyone who can open the repo gets the admin password. The try/except/pass was also Low, yet it was silently hiding failed postal ballot imports. On the Pylint side, missing docstrings and camelCase names pulled the score down the most but changed no behaviour. So I fixed issues in order of actual impact, not by the label each tool gave them.</w:t>
       </w:r>
     </w:p>
     <w:p>
@@ -3803,7 +3803,7 @@
         <w:spacing w:after="120" w:before="220"/>
       </w:pPr>
       <w:r>
-        <w:t xml:space="preserve">Q4. What tangible improvements did you see in the code after the fixes?</w:t>
+        <w:t xml:space="preserve">Q4. What would you do differently in your next project after this lab?</w:t>
       </w:r>
     </w:p>
     <w:p>
@@ -3812,7 +3812,7 @@
         <w:spacing w:after="120"/>
       </w:pPr>
       <w:r>
-        <w:t xml:space="preserve">Pylint went from 5.33 to 10.00, Bandit from 7 findings (2 High) to 0, and Flake8 from 30 warnings to 0. Voters can no longer pass as officers, XML attacks are blocked, receipts are unpredictable and the password is out of source control. The program now gives correct results: tally {'Alice': 1, 'Bob': 2, 'NOTA': 0}, turnout 75%, one vote per voter. The code is easier to read, with consistent names, docstrings and one shared validation path for in-person and postal votes.</w:t>
+        <w:t xml:space="preserve">I would run the tools from the first commit instead of at the end. Most of the 30 Flake8 warnings were blank lines, long lines and trailing spaces that an auto-formatter such as black fixes on save. A pre-commit hook that blocks Bandit Medium and High findings would have stopped MD5, unsafe XML and the hidden characters from ever being committed, and a GitHub Actions job could run all three tools on every push. Since the logic bugs passed every tool, I would also write small tests for rules like "one vote per voter" and "no votes after 18:00". A clean Pylint score does not prove the election result is correct.</w:t>
       </w:r>
     </w:p>
     <w:sectPr>

</xml_diff>

<commit_message>
Update commit IDs in issue table and report
</commit_message>
<xml_diff>
--- a/PES2UG25CS820_Lab5_Report.docx
+++ b/PES2UG25CS820_Lab5_Report.docx
@@ -60,7 +60,7 @@
       <w:pPr>
         <w:spacing w:after="60"/>
       </w:pPr>
-      <w:hyperlink w:history="1" r:id="rIdedvedozudqhrxqfypflrs">
+      <w:hyperlink w:history="1" r:id="rIdv3je8hk4zjjvs3ox4ygdk">
         <w:r>
           <w:rPr>
             <w:rStyle w:val="Hyperlink"/>
@@ -83,7 +83,7 @@
           <w:sz w:val="20"/>
           <w:szCs w:val="20"/>
         </w:rPr>
-        <w:t xml:space="preserve">Commits: b057412 Fix Bandit security issues · e6cbbab Fix Pylint issues and logic bugs · b37a5e1 Fix Flake8 style issues</w:t>
+        <w:t xml:space="preserve">Commits: 13dfc47 Fix Bandit security issues · 0261ffa Fix Pylint issues and logic bugs · 94fe10d Fix Flake8 style issues</w:t>
       </w:r>
     </w:p>
     <w:p>

</xml_diff>

<commit_message>
Add original repo link to report
</commit_message>
<xml_diff>
--- a/PES2UG25CS820_Lab5_Report.docx
+++ b/PES2UG25CS820_Lab5_Report.docx
@@ -60,7 +60,34 @@
       <w:pPr>
         <w:spacing w:after="60"/>
       </w:pPr>
-      <w:hyperlink w:history="1" r:id="rIdv3je8hk4zjjvs3ox4ygdk">
+      <w:r>
+        <w:rPr>
+          <w:b/>
+          <w:bCs/>
+        </w:rPr>
+        <w:t xml:space="preserve">Before (original repo): </w:t>
+      </w:r>
+      <w:hyperlink w:history="1" r:id="rId0afw_as2ijqdqozxsnojb">
+        <w:r>
+          <w:rPr>
+            <w:rStyle w:val="Hyperlink"/>
+          </w:rPr>
+          <w:t xml:space="preserve">https://github.com/SETAPESU26/L5_62_voting-election-system</w:t>
+        </w:r>
+      </w:hyperlink>
+    </w:p>
+    <w:p>
+      <w:pPr>
+        <w:spacing w:after="60"/>
+      </w:pPr>
+      <w:r>
+        <w:rPr>
+          <w:b/>
+          <w:bCs/>
+        </w:rPr>
+        <w:t xml:space="preserve">After (my fork with fixes): </w:t>
+      </w:r>
+      <w:hyperlink w:history="1" r:id="rIdezzqz38umkxahkh0c-wnh">
         <w:r>
           <w:rPr>
             <w:rStyle w:val="Hyperlink"/>

</xml_diff>